<commit_message>
trigger action for yml
</commit_message>
<xml_diff>
--- a/content/storylines/Vrey-Prelude-of-Fear/Chapter_1.docx
+++ b/content/storylines/Vrey-Prelude-of-Fear/Chapter_1.docx
@@ -33,7 +33,15 @@
         <w:spacing w:before="240" w:after="240"/>
       </w:pPr>
       <w:r>
-        <w:t>It’s a new academic year! Congratulations to all freshies, who got into the prestigious Hevrion magic campus, and not only that, accepted a once in a lifetime offer of membership to an extracurricular activity called ‘Hevrion Adventuring Society’. Now, all of you, along with all other academicians, new and old, arrived in the campus’ amphitheatre and sat in your marble seats adorned with beautiful engravings of heroes.</w:t>
+        <w:t xml:space="preserve">It’s a new academic year! Congratulations to all freshies, who got into the prestigious Hevrion magic campus, and not only that, accepted a once in a lifetime offer of membership to an extracurricular activity called ‘Hevrion Adventuring Society’. Now, all of you, along with all other academicians, new and old, arrived in the campus’ </w:t>
+      </w:r>
+      <w:proofErr w:type="spellStart"/>
+      <w:r>
+        <w:t>amphitheatre</w:t>
+      </w:r>
+      <w:proofErr w:type="spellEnd"/>
+      <w:r>
+        <w:t xml:space="preserve"> and sat in your marble seats adorned with beautiful engravings of heroes.</w:t>
       </w:r>
     </w:p>
     <w:p>
@@ -43,23 +51,64 @@
       <w:r>
         <w:t xml:space="preserve">Above the stage, a fire burns bright on top of an altar. Below it stood a half-elf, tapping his fingers on some kind of device. “Hello…, hello? Ah, the </w:t>
       </w:r>
+      <w:proofErr w:type="spellStart"/>
       <w:r>
         <w:rPr>
           <w:i/>
           <w:iCs/>
         </w:rPr>
-        <w:t xml:space="preserve">Tonverstärker* </w:t>
-      </w:r>
-      <w:r>
-        <w:t>is not working again. Ms Sapphire, this magic device is broken again. I know the maintenance is costly, but can we at least ensure it is working before crucial ceremonies please? “</w:t>
-      </w:r>
-    </w:p>
-    <w:p>
-      <w:pPr>
-        <w:spacing w:before="240" w:after="240"/>
-      </w:pPr>
-      <w:r>
-        <w:t>Behind him, multiple people with different coloured robes sat on their respective tables. Amongst them, someone stands up. She has a horn adorned with what you presume are jewelleries. She has a long nose and dropping ears on her white, furry face, with a large black path covering her right cheek and chin. She adorns a gray robe with intricate gold lines forming patterns. Ms Sapphire bows to the man on the podium with an annoyed grin (RBF) and sits back down. The man smiles and nods in return.</w:t>
+        <w:t>Tonverstärker</w:t>
+      </w:r>
+      <w:proofErr w:type="spellEnd"/>
+      <w:r>
+        <w:rPr>
+          <w:i/>
+          <w:iCs/>
+        </w:rPr>
+        <w:t xml:space="preserve">* </w:t>
+      </w:r>
+      <w:r>
+        <w:t xml:space="preserve">is not working again. </w:t>
+      </w:r>
+      <w:proofErr w:type="spellStart"/>
+      <w:r>
+        <w:t>Ms</w:t>
+      </w:r>
+      <w:proofErr w:type="spellEnd"/>
+      <w:r>
+        <w:t xml:space="preserve"> Sapphire, this magic device is broken again. I know the maintenance is costly, but can we at least ensure it is working before crucial ceremonies please? “</w:t>
+      </w:r>
+    </w:p>
+    <w:p>
+      <w:pPr>
+        <w:spacing w:before="240" w:after="240"/>
+      </w:pPr>
+      <w:r>
+        <w:t xml:space="preserve">Behind him, multiple people with different </w:t>
+      </w:r>
+      <w:proofErr w:type="spellStart"/>
+      <w:r>
+        <w:t>coloured</w:t>
+      </w:r>
+      <w:proofErr w:type="spellEnd"/>
+      <w:r>
+        <w:t xml:space="preserve"> robes sat on their respective tables. Amongst them, someone stands up. She has a horn adorned with what you presume are </w:t>
+      </w:r>
+      <w:proofErr w:type="spellStart"/>
+      <w:r>
+        <w:t>jewelleries</w:t>
+      </w:r>
+      <w:proofErr w:type="spellEnd"/>
+      <w:r>
+        <w:t xml:space="preserve">. She has a long nose and dropping ears on her white, furry face, with a large black path covering her right cheek and chin. She adorns a gray robe with intricate gold lines forming patterns. </w:t>
+      </w:r>
+      <w:proofErr w:type="spellStart"/>
+      <w:r>
+        <w:t>Ms</w:t>
+      </w:r>
+      <w:proofErr w:type="spellEnd"/>
+      <w:r>
+        <w:t xml:space="preserve"> Sapphire bows to the man on the podium with an annoyed grin (RBF) and sits back down. The man smiles and nods in return.</w:t>
       </w:r>
     </w:p>
     <w:p>
@@ -130,6 +179,7 @@
       <w:r>
         <w:t xml:space="preserve">“Ah, I almost forgot. If you have questions, you can approach the teachers. Also Remember to submit your </w:t>
       </w:r>
+      <w:proofErr w:type="spellStart"/>
       <w:r>
         <w:rPr>
           <w:i/>
@@ -137,6 +187,7 @@
         </w:rPr>
         <w:t>societa</w:t>
       </w:r>
+      <w:proofErr w:type="spellEnd"/>
       <w:r>
         <w:t xml:space="preserve"> (club) form and your course in 3 days. Adventuring society members, please meet me at my office after this.” You can hear the same voice of the principal despite him not being present anymore, before you hear a beep sound and silence.</w:t>
       </w:r>
@@ -154,7 +205,15 @@
         <w:spacing w:before="240" w:after="240"/>
       </w:pPr>
       <w:r>
-        <w:t>From the gaps on the ceiling of the amphitheatre, you can see a tall, distinctive tower. You instinctively know that there lies your next destination.</w:t>
+        <w:t xml:space="preserve">From the gaps on the ceiling of the </w:t>
+      </w:r>
+      <w:proofErr w:type="spellStart"/>
+      <w:r>
+        <w:t>amphitheatre</w:t>
+      </w:r>
+      <w:proofErr w:type="spellEnd"/>
+      <w:r>
+        <w:t>, you can see a tall, distinctive tower. You instinctively know that there lies your next destination.</w:t>
       </w:r>
     </w:p>
     <w:p>
@@ -170,7 +229,31 @@
         <w:spacing w:before="240" w:after="240"/>
       </w:pPr>
       <w:r>
-        <w:t>[Nguingggg (undertale lift sfx)] There are two rooms in front of you. On the left is the principal’s office, and on the right, a wooden door with a plaque that says: HAS. (it’s locked)</w:t>
+        <w:t>[</w:t>
+      </w:r>
+      <w:proofErr w:type="spellStart"/>
+      <w:r>
+        <w:t>Nguingggg</w:t>
+      </w:r>
+      <w:proofErr w:type="spellEnd"/>
+      <w:r>
+        <w:t xml:space="preserve"> (</w:t>
+      </w:r>
+      <w:proofErr w:type="spellStart"/>
+      <w:r>
+        <w:t>undertale</w:t>
+      </w:r>
+      <w:proofErr w:type="spellEnd"/>
+      <w:r>
+        <w:t xml:space="preserve"> lift </w:t>
+      </w:r>
+      <w:proofErr w:type="spellStart"/>
+      <w:r>
+        <w:t>sfx</w:t>
+      </w:r>
+      <w:proofErr w:type="spellEnd"/>
+      <w:r>
+        <w:t>)] There are two rooms in front of you. On the left is the principal’s office, and on the right, a wooden door with a plaque that says: HAS. (it’s locked)</w:t>
       </w:r>
     </w:p>
     <w:p>
@@ -186,7 +269,15 @@
         <w:spacing w:before="240" w:after="240"/>
       </w:pPr>
       <w:r>
-        <w:t>The interior is outlined with many books and stacks and stacks of parchments. One of the stacks almost completely covers an expensive looking table in the middle of the office. But the principle is not behind this table. You spot the principal sitting on the floor, in the corner of his office almost buried in the middle of a pile of papers. “Oh! Welcome, welcome.” The piles of papers float beside him and fall down in an organised manner, while he stands and walk to a counter with a stack of cups and clay (kettle? Kendi). “Tea or coffee?”  [Pours something on an empty cup] “Wrong, it’s []” [slurps] “Ah, please help yourself (idk if this is the correct expression). Other than [], we have [the other one], milk, wine, fermented apples, and coconut.” [points to the counter while sipping].</w:t>
+        <w:t xml:space="preserve">The interior is outlined with many books and stacks and stacks of parchments. One of the stacks almost completely covers an expensive looking table in the middle of the office. But the principle is not behind this table. You spot the principal sitting on the floor, in the corner of his office almost buried in the middle of a pile of papers. “Oh! Welcome, welcome.” The piles of papers float beside him and fall down in an </w:t>
+      </w:r>
+      <w:proofErr w:type="spellStart"/>
+      <w:r>
+        <w:t>organised</w:t>
+      </w:r>
+      <w:proofErr w:type="spellEnd"/>
+      <w:r>
+        <w:t xml:space="preserve"> manner, while he stands and walk to a counter with a stack of cups and clay (kettle? Kendi). “Tea or coffee?”  [Pours something on an empty cup] “Wrong, it’s []” [slurps] “Ah, please help yourself (idk if this is the correct expression). Other than [], we have [the other one], milk, wine, fermented apples, and coconut.” [points to the counter while sipping].</w:t>
       </w:r>
     </w:p>
     <w:p>
@@ -222,7 +313,15 @@
         <w:spacing w:before="240" w:after="240"/>
       </w:pPr>
       <w:r>
-        <w:t>He scratched his head. “Normally we get quartzite from the Wise trade guild, in Tethford, roughly 150 miles west following the coastline. Every month, a middleman would come with 5 barrels, and we would pay 300 gold per barrel. However, the supplies stopped roughly 3 months ago. As I can’t personally go outside of the campus, you have to investigate and resolve this issue for us.”</w:t>
+        <w:t xml:space="preserve">He scratched his head. “Normally we get quartzite from the Wise trade guild, in </w:t>
+      </w:r>
+      <w:proofErr w:type="spellStart"/>
+      <w:r>
+        <w:t>Tethford</w:t>
+      </w:r>
+      <w:proofErr w:type="spellEnd"/>
+      <w:r>
+        <w:t>, roughly 150 miles west following the coastline. Every month, a middleman would come with 5 barrels, and we would pay 300 gold per barrel. However, the supplies stopped roughly 3 months ago. As I can’t personally go outside of the campus, you have to investigate and resolve this issue for us.”</w:t>
       </w:r>
     </w:p>
     <w:p>
@@ -313,23 +412,53 @@
         <w:spacing w:before="240" w:after="240"/>
       </w:pPr>
       <w:r>
-        <w:t>“Mornin’, I am Jacob Wizeman, owner of Wise trading company. It’s been a while since Hevrion contacted us, and by the looks of it, you’re from the adventuring society, yes? I’m surprised there’re still students willing to join that. Thought everyone would call it quits” He laughed.</w:t>
-      </w:r>
-    </w:p>
-    <w:p>
-      <w:pPr>
-        <w:spacing w:before="240" w:after="240"/>
-      </w:pPr>
-      <w:r>
-        <w:t>“What’re y’ here for today?” “Ah, the quartzite issue. Let me call someone - Harky! Come’ere please!”</w:t>
-      </w:r>
-    </w:p>
-    <w:p>
-      <w:pPr>
-        <w:spacing w:before="240" w:after="240"/>
-      </w:pPr>
-      <w:r>
-        <w:t>“Aight, let me introduce you to our quartzite middleman, Harky. She’s currently also a ship captain in charge for other goods too. Now, I’ll be direct to you – we found a more profitable buyer for quartzite. You see, 4 months ago, another buyer came to us, offered 200 gold per barrel. That’s much more profitable compared to the 750 gold we got from Hevrion. So, we simply decided to switch customers.”</w:t>
+        <w:t>“</w:t>
+      </w:r>
+      <w:proofErr w:type="spellStart"/>
+      <w:r>
+        <w:t>Mornin</w:t>
+      </w:r>
+      <w:proofErr w:type="spellEnd"/>
+      <w:r>
+        <w:t>’, I am Jacob Wizeman, owner of Wise trading company. It’s been a while since Hevrion contacted us, and by the looks of it, you’re from the adventuring society, yes? I’m surprised there’re still students willing to join that. Thought everyone would call it quits” He laughed.</w:t>
+      </w:r>
+    </w:p>
+    <w:p>
+      <w:pPr>
+        <w:spacing w:before="240" w:after="240"/>
+      </w:pPr>
+      <w:r>
+        <w:t xml:space="preserve">“What’re y’ here for today?” “Ah, the quartzite issue. Let me call someone - Harky! </w:t>
+      </w:r>
+      <w:proofErr w:type="spellStart"/>
+      <w:r>
+        <w:t>Come’ere</w:t>
+      </w:r>
+      <w:proofErr w:type="spellEnd"/>
+      <w:r>
+        <w:t xml:space="preserve"> please!”</w:t>
+      </w:r>
+    </w:p>
+    <w:p>
+      <w:pPr>
+        <w:spacing w:before="240" w:after="240"/>
+      </w:pPr>
+      <w:r>
+        <w:t>“</w:t>
+      </w:r>
+      <w:proofErr w:type="spellStart"/>
+      <w:r>
+        <w:t>Aight</w:t>
+      </w:r>
+      <w:proofErr w:type="spellEnd"/>
+      <w:r>
+        <w:t xml:space="preserve">, let me introduce you to our quartzite middleman, Harky. She’s currently also a ship captain in charge </w:t>
+      </w:r>
+      <w:r>
+        <w:t>of</w:t>
+      </w:r>
+      <w:r>
+        <w:t xml:space="preserve"> other goods too. Now, I’ll be direct to you – we found a more profitable buyer for quartzite. You see, 4 months ago, another buyer came to us, offered 200 gold per barrel. That’s much more profitable compared to the 750 gold we got from Hevrion. So, we simply decided to switch customers.”</w:t>
       </w:r>
     </w:p>
     <w:p>
@@ -345,39 +474,45 @@
           <w:b/>
           <w:bCs/>
         </w:rPr>
-        <w:t>If players pointed out discrepancies:</w:t>
-      </w:r>
-    </w:p>
-    <w:p>
-      <w:pPr>
-        <w:spacing w:before="240" w:after="240"/>
-      </w:pPr>
-      <w:r>
-        <w:t>“Hm? That’s surely interesting.” His expression turned serious. “Explain, Harky”</w:t>
-      </w:r>
-    </w:p>
-    <w:p>
-      <w:pPr>
-        <w:spacing w:before="240" w:after="240"/>
-      </w:pPr>
-      <w:r>
-        <w:t>“Umm you see, there are checkpoints between Hevrion and Tethford, and I am forced to pay them a portion of the earnings. Now that we go by the sea, we don’t need to pay for those checkpoints anymore.” Harky said.</w:t>
-      </w:r>
-    </w:p>
-    <w:p>
-      <w:pPr>
-        <w:spacing w:before="240" w:after="240"/>
+        <w:t xml:space="preserve">If players </w:t>
+      </w:r>
+      <w:r>
         <w:rPr>
           <w:b/>
           <w:bCs/>
         </w:rPr>
-      </w:pPr>
+        <w:t>point</w:t>
+      </w:r>
       <w:r>
         <w:rPr>
           <w:b/>
           <w:bCs/>
         </w:rPr>
-        <w:t>Change into an action roll if the story isn’t going anywhere: If a player recalls that there are no checkpoints / (12) history check / (8) history check (for certain players) #1 / (16) history check #2:</w:t>
+        <w:t xml:space="preserve"> out discrepancies:</w:t>
+      </w:r>
+    </w:p>
+    <w:p>
+      <w:pPr>
+        <w:spacing w:before="240" w:after="240"/>
+      </w:pPr>
+      <w:r>
+        <w:t>“Hm? That’s surely interesting.” His expression turned serious. “Explain, Harky”</w:t>
+      </w:r>
+    </w:p>
+    <w:p>
+      <w:pPr>
+        <w:spacing w:before="240" w:after="240"/>
+      </w:pPr>
+      <w:r>
+        <w:t xml:space="preserve">“Umm you see, there are checkpoints between Hevrion and </w:t>
+      </w:r>
+      <w:proofErr w:type="spellStart"/>
+      <w:r>
+        <w:t>Tethford</w:t>
+      </w:r>
+      <w:proofErr w:type="spellEnd"/>
+      <w:r>
+        <w:t>, and I am forced to pay them a portion of the earnings. Now that we go by the sea, we don’t need to pay for those checkpoints anymore.” Harky said.</w:t>
       </w:r>
     </w:p>
     <w:p>
@@ -393,15 +528,7 @@
           <w:b/>
           <w:bCs/>
         </w:rPr>
-        <w:t>#1: You recall there is never such checkpoints between Hevrion and Tethford.</w:t>
-      </w:r>
-    </w:p>
-    <w:p>
-      <w:pPr>
-        <w:spacing w:before="240" w:after="240"/>
-      </w:pPr>
-      <w:r>
-        <w:t>“Well, t-they probably disband the checkpoints after we stop paying because it’s not profitable anymore” Harky sweats a bit.</w:t>
+        <w:t>Change into an action roll if the story isn’t going anywhere: If a player recalls that there are no checkpoints / (12) history check / (8) history check (for certain players) #1 / (16) history check #2:</w:t>
       </w:r>
     </w:p>
     <w:p>
@@ -417,7 +544,63 @@
           <w:b/>
           <w:bCs/>
         </w:rPr>
-        <w:t>#2: (reminder) The caravan that you used to go to Tethford is full of goods</w:t>
+        <w:t xml:space="preserve">#1: You recall there is never such checkpoints between Hevrion and </w:t>
+      </w:r>
+      <w:proofErr w:type="spellStart"/>
+      <w:r>
+        <w:rPr>
+          <w:b/>
+          <w:bCs/>
+        </w:rPr>
+        <w:t>Tethford</w:t>
+      </w:r>
+      <w:proofErr w:type="spellEnd"/>
+      <w:r>
+        <w:rPr>
+          <w:b/>
+          <w:bCs/>
+        </w:rPr>
+        <w:t>.</w:t>
+      </w:r>
+    </w:p>
+    <w:p>
+      <w:pPr>
+        <w:spacing w:before="240" w:after="240"/>
+      </w:pPr>
+      <w:r>
+        <w:t>“Well, t-they probably disband the checkpoints after we stop paying because it’s not profitable anymore” Harky sweats a bit.</w:t>
+      </w:r>
+    </w:p>
+    <w:p>
+      <w:pPr>
+        <w:spacing w:before="240" w:after="240"/>
+        <w:rPr>
+          <w:b/>
+          <w:bCs/>
+        </w:rPr>
+      </w:pPr>
+      <w:r>
+        <w:rPr>
+          <w:b/>
+          <w:bCs/>
+        </w:rPr>
+        <w:t xml:space="preserve">#2: (reminder) The caravan that you used to go to </w:t>
+      </w:r>
+      <w:proofErr w:type="spellStart"/>
+      <w:r>
+        <w:rPr>
+          <w:b/>
+          <w:bCs/>
+        </w:rPr>
+        <w:t>Tethford</w:t>
+      </w:r>
+      <w:proofErr w:type="spellEnd"/>
+      <w:r>
+        <w:rPr>
+          <w:b/>
+          <w:bCs/>
+        </w:rPr>
+        <w:t xml:space="preserve"> is full of goods</w:t>
       </w:r>
     </w:p>
     <w:p>
@@ -463,7 +646,15 @@
         <w:spacing w:before="240" w:after="240"/>
       </w:pPr>
       <w:r>
-        <w:t xml:space="preserve">Harky starts 2 nodes away but hidden and will always move towards the harbour using 1 fear. The DM has to keep tabs on her movement and placement. Meanwhile, the players can roll an action to attempt to spot Harky. She will be hidden again by spending 1 fear. Harky will always attempt to </w:t>
+        <w:t xml:space="preserve">Harky starts 2 nodes away but hidden and will always move towards the </w:t>
+      </w:r>
+      <w:proofErr w:type="spellStart"/>
+      <w:r>
+        <w:t>harbour</w:t>
+      </w:r>
+      <w:proofErr w:type="spellEnd"/>
+      <w:r>
+        <w:t xml:space="preserve"> using 1 fear. The DM has to keep tabs on her movement and placement. Meanwhile, the players can roll an action to attempt to spot Harky. She will be hidden again by spending 1 fear. Harky will always attempt to </w:t>
       </w:r>
       <w:r>
         <w:rPr>
@@ -491,7 +682,15 @@
         <w:spacing w:before="240" w:after="240"/>
       </w:pPr>
       <w:r>
-        <w:t>Once Harky reaches ~ 1/3 of the distance to the harbour, if no player has spotted him, a blast will go off at her location (she is still hidden). She will be revealed if there is a player on the node. Else, the players will be notified of Harky’s general direction.</w:t>
+        <w:t xml:space="preserve">Once Harky reaches ~ 1/3 of the distance to the </w:t>
+      </w:r>
+      <w:proofErr w:type="spellStart"/>
+      <w:r>
+        <w:t>harbour</w:t>
+      </w:r>
+      <w:proofErr w:type="spellEnd"/>
+      <w:r>
+        <w:t>, if no player has spotted him, a blast will go off at her location (she is still hidden). She will be revealed if there is a player on the node. Else, the players will be notified of Harky’s general direction.</w:t>
       </w:r>
     </w:p>
     <w:tbl>
@@ -598,9 +797,11 @@
                   </w:tcMar>
                 </w:tcPr>
                 <w:p>
+                  <w:proofErr w:type="spellStart"/>
                   <w:r>
                     <w:t>Thres</w:t>
                   </w:r>
+                  <w:proofErr w:type="spellEnd"/>
                 </w:p>
               </w:tc>
               <w:tc>
@@ -661,9 +862,11 @@
                   </w:tcMar>
                 </w:tcPr>
                 <w:p>
+                  <w:proofErr w:type="spellStart"/>
                   <w:r>
                     <w:t>Atk</w:t>
                   </w:r>
+                  <w:proofErr w:type="spellEnd"/>
                 </w:p>
               </w:tc>
             </w:tr>
@@ -820,8 +1023,13 @@
               <w:t xml:space="preserve">Cutlass: </w:t>
             </w:r>
             <w:r>
-              <w:t>Melee | 1d12+2 phy</w:t>
-            </w:r>
+              <w:t xml:space="preserve">Melee | 1d12+2 </w:t>
+            </w:r>
+            <w:proofErr w:type="spellStart"/>
+            <w:r>
+              <w:t>phy</w:t>
+            </w:r>
+            <w:proofErr w:type="spellEnd"/>
           </w:p>
           <w:p>
             <w:pPr>
@@ -1025,7 +1233,15 @@
         <w:spacing w:before="240" w:after="240"/>
       </w:pPr>
       <w:r>
-        <w:t>If Harky reaches the harbour:</w:t>
+        <w:t xml:space="preserve">If Harky reaches the </w:t>
+      </w:r>
+      <w:proofErr w:type="spellStart"/>
+      <w:r>
+        <w:t>harbour</w:t>
+      </w:r>
+      <w:proofErr w:type="spellEnd"/>
+      <w:r>
+        <w:t>:</w:t>
       </w:r>
     </w:p>
     <w:p>
@@ -1119,15 +1335,28 @@
         <w:spacing w:before="240" w:after="240"/>
       </w:pPr>
       <w:r>
-        <w:t>Principal welcomes back the party with Ms Sapphire</w:t>
-      </w:r>
-    </w:p>
-    <w:p>
-      <w:pPr>
-        <w:spacing w:before="240" w:after="240"/>
-      </w:pPr>
-      <w:r>
-        <w:t>Ms Sapphire hugs the barrels of quartzite. Ahem, thank you, thank you for this! Ah, as repayment, you can contact us if you need any equipment repaired, or if you want to create magical stuff!</w:t>
+        <w:t xml:space="preserve">Principal welcomes back the party with </w:t>
+      </w:r>
+      <w:proofErr w:type="spellStart"/>
+      <w:r>
+        <w:t>Ms</w:t>
+      </w:r>
+      <w:proofErr w:type="spellEnd"/>
+      <w:r>
+        <w:t xml:space="preserve"> Sapphire</w:t>
+      </w:r>
+    </w:p>
+    <w:p>
+      <w:pPr>
+        <w:spacing w:before="240" w:after="240"/>
+      </w:pPr>
+      <w:proofErr w:type="spellStart"/>
+      <w:r>
+        <w:t>Ms</w:t>
+      </w:r>
+      <w:proofErr w:type="spellEnd"/>
+      <w:r>
+        <w:t xml:space="preserve"> Sapphire hugs the barrels of quartzite. Ahem, thank you, thank you for this! Ah, as repayment, you can contact us if you need any equipment repaired, or if you want to create magical stuff!</w:t>
       </w:r>
     </w:p>
     <w:p>

</xml_diff>

<commit_message>
Edited generate.py to reseolve syntax error
</commit_message>
<xml_diff>
--- a/content/storylines/Vrey-Prelude-of-Fear/Chapter_1.docx
+++ b/content/storylines/Vrey-Prelude-of-Fear/Chapter_1.docx
@@ -33,15 +33,7 @@
         <w:spacing w:before="240" w:after="240"/>
       </w:pPr>
       <w:r>
-        <w:t xml:space="preserve">It’s a new academic year! Congratulations to all freshies, who got into the prestigious Hevrion magic campus, and not only that, accepted a once in a lifetime offer of membership to an extracurricular activity called ‘Hevrion Adventuring Society’. Now, all of you, along with all other academicians, new and old, arrived in the campus’ </w:t>
-      </w:r>
-      <w:proofErr w:type="spellStart"/>
-      <w:r>
-        <w:t>amphitheatre</w:t>
-      </w:r>
-      <w:proofErr w:type="spellEnd"/>
-      <w:r>
-        <w:t xml:space="preserve"> and sat in your marble seats adorned with beautiful engravings of heroes.</w:t>
+        <w:t>It’s a new academic year! Congratulations to all freshies, who got into the prestigious Hevrion magic campus, and not only that, accepted a once in a lifetime offer of membership to an extracurricular activity called ‘Hevrion Adventuring Society’. Now, all of you, along with all other academicians, new and old, arrived in the campus’ amphitheatre and sat in your marble seats adorned with beautiful engravings of heroes.</w:t>
       </w:r>
     </w:p>
     <w:p>
@@ -51,64 +43,23 @@
       <w:r>
         <w:t xml:space="preserve">Above the stage, a fire burns bright on top of an altar. Below it stood a half-elf, tapping his fingers on some kind of device. “Hello…, hello? Ah, the </w:t>
       </w:r>
-      <w:proofErr w:type="spellStart"/>
       <w:r>
         <w:rPr>
           <w:i/>
           <w:iCs/>
         </w:rPr>
-        <w:t>Tonverstärker</w:t>
-      </w:r>
-      <w:proofErr w:type="spellEnd"/>
-      <w:r>
-        <w:rPr>
-          <w:i/>
-          <w:iCs/>
-        </w:rPr>
-        <w:t xml:space="preserve">* </w:t>
-      </w:r>
-      <w:r>
-        <w:t xml:space="preserve">is not working again. </w:t>
-      </w:r>
-      <w:proofErr w:type="spellStart"/>
-      <w:r>
-        <w:t>Ms</w:t>
-      </w:r>
-      <w:proofErr w:type="spellEnd"/>
-      <w:r>
-        <w:t xml:space="preserve"> Sapphire, this magic device is broken again. I know the maintenance is costly, but can we at least ensure it is working before crucial ceremonies please? “</w:t>
-      </w:r>
-    </w:p>
-    <w:p>
-      <w:pPr>
-        <w:spacing w:before="240" w:after="240"/>
-      </w:pPr>
-      <w:r>
-        <w:t xml:space="preserve">Behind him, multiple people with different </w:t>
-      </w:r>
-      <w:proofErr w:type="spellStart"/>
-      <w:r>
-        <w:t>coloured</w:t>
-      </w:r>
-      <w:proofErr w:type="spellEnd"/>
-      <w:r>
-        <w:t xml:space="preserve"> robes sat on their respective tables. Amongst them, someone stands up. She has a horn adorned with what you presume are </w:t>
-      </w:r>
-      <w:proofErr w:type="spellStart"/>
-      <w:r>
-        <w:t>jewelleries</w:t>
-      </w:r>
-      <w:proofErr w:type="spellEnd"/>
-      <w:r>
-        <w:t xml:space="preserve">. She has a long nose and dropping ears on her white, furry face, with a large black path covering her right cheek and chin. She adorns a gray robe with intricate gold lines forming patterns. </w:t>
-      </w:r>
-      <w:proofErr w:type="spellStart"/>
-      <w:r>
-        <w:t>Ms</w:t>
-      </w:r>
-      <w:proofErr w:type="spellEnd"/>
-      <w:r>
-        <w:t xml:space="preserve"> Sapphire bows to the man on the podium with an annoyed grin (RBF) and sits back down. The man smiles and nods in return.</w:t>
+        <w:t xml:space="preserve">Tonverstärker* </w:t>
+      </w:r>
+      <w:r>
+        <w:t>is not working again. Ms Sapphire, this magic device is broken again. I know the maintenance is costly, but can we at least ensure it is working before crucial ceremonies please? “</w:t>
+      </w:r>
+    </w:p>
+    <w:p>
+      <w:pPr>
+        <w:spacing w:before="240" w:after="240"/>
+      </w:pPr>
+      <w:r>
+        <w:t>Behind him, multiple people with different coloured robes sat on their respective tables. Amongst them, someone stands up. She has a horn adorned with what you presume are jewelleries. She has a long nose and dropping ears on her white, furry face, with a large black path covering her right cheek and chin. She adorns a gray robe with intricate gold lines forming patterns. Ms Sapphire bows to the man on the podium with an annoyed grin (RBF) and sits back down. The man smiles and nods in return.</w:t>
       </w:r>
     </w:p>
     <w:p>
@@ -179,7 +130,6 @@
       <w:r>
         <w:t xml:space="preserve">“Ah, I almost forgot. If you have questions, you can approach the teachers. Also Remember to submit your </w:t>
       </w:r>
-      <w:proofErr w:type="spellStart"/>
       <w:r>
         <w:rPr>
           <w:i/>
@@ -187,7 +137,6 @@
         </w:rPr>
         <w:t>societa</w:t>
       </w:r>
-      <w:proofErr w:type="spellEnd"/>
       <w:r>
         <w:t xml:space="preserve"> (club) form and your course in 3 days. Adventuring society members, please meet me at my office after this.” You can hear the same voice of the principal despite him not being present anymore, before you hear a beep sound and silence.</w:t>
       </w:r>
@@ -205,15 +154,7 @@
         <w:spacing w:before="240" w:after="240"/>
       </w:pPr>
       <w:r>
-        <w:t xml:space="preserve">From the gaps on the ceiling of the </w:t>
-      </w:r>
-      <w:proofErr w:type="spellStart"/>
-      <w:r>
-        <w:t>amphitheatre</w:t>
-      </w:r>
-      <w:proofErr w:type="spellEnd"/>
-      <w:r>
-        <w:t>, you can see a tall, distinctive tower. You instinctively know that there lies your next destination.</w:t>
+        <w:t>From the gaps on the ceiling of the amphitheatre, you can see a tall, distinctive tower. You instinctively know that there lies your next destination.</w:t>
       </w:r>
     </w:p>
     <w:p>
@@ -229,31 +170,7 @@
         <w:spacing w:before="240" w:after="240"/>
       </w:pPr>
       <w:r>
-        <w:t>[</w:t>
-      </w:r>
-      <w:proofErr w:type="spellStart"/>
-      <w:r>
-        <w:t>Nguingggg</w:t>
-      </w:r>
-      <w:proofErr w:type="spellEnd"/>
-      <w:r>
-        <w:t xml:space="preserve"> (</w:t>
-      </w:r>
-      <w:proofErr w:type="spellStart"/>
-      <w:r>
-        <w:t>undertale</w:t>
-      </w:r>
-      <w:proofErr w:type="spellEnd"/>
-      <w:r>
-        <w:t xml:space="preserve"> lift </w:t>
-      </w:r>
-      <w:proofErr w:type="spellStart"/>
-      <w:r>
-        <w:t>sfx</w:t>
-      </w:r>
-      <w:proofErr w:type="spellEnd"/>
-      <w:r>
-        <w:t>)] There are two rooms in front of you. On the left is the principal’s office, and on the right, a wooden door with a plaque that says: HAS. (it’s locked)</w:t>
+        <w:t>[Nguingggg (undertale lift sfx)] There are two rooms in front of you. On the left is the principal’s office, and on the right, a wooden door with a plaque that says: HAS. (it’s locked)</w:t>
       </w:r>
     </w:p>
     <w:p>
@@ -269,15 +186,7 @@
         <w:spacing w:before="240" w:after="240"/>
       </w:pPr>
       <w:r>
-        <w:t xml:space="preserve">The interior is outlined with many books and stacks and stacks of parchments. One of the stacks almost completely covers an expensive looking table in the middle of the office. But the principle is not behind this table. You spot the principal sitting on the floor, in the corner of his office almost buried in the middle of a pile of papers. “Oh! Welcome, welcome.” The piles of papers float beside him and fall down in an </w:t>
-      </w:r>
-      <w:proofErr w:type="spellStart"/>
-      <w:r>
-        <w:t>organised</w:t>
-      </w:r>
-      <w:proofErr w:type="spellEnd"/>
-      <w:r>
-        <w:t xml:space="preserve"> manner, while he stands and walk to a counter with a stack of cups and clay (kettle? Kendi). “Tea or coffee?”  [Pours something on an empty cup] “Wrong, it’s []” [slurps] “Ah, please help yourself (idk if this is the correct expression). Other than [], we have [the other one], milk, wine, fermented apples, and coconut.” [points to the counter while sipping].</w:t>
+        <w:t>The interior is outlined with many books and stacks and stacks of parchments. One of the stacks almost completely covers an expensive looking table in the middle of the office. But the principle is not behind this table. You spot the principal sitting on the floor, in the corner of his office almost buried in the middle of a pile of papers. “Oh! Welcome, welcome.” The piles of papers float beside him and fall down in an organised manner, while he stands and walk to a counter with a stack of cups and clay (kettle? Kendi). “Tea or coffee?”  [Pours something on an empty cup] “Wrong, it’s []” [slurps] “Ah, please help yourself (idk if this is the correct expression). Other than [], we have [the other one], milk, wine, fermented apples, and coconut.” [points to the counter while sipping].</w:t>
       </w:r>
     </w:p>
     <w:p>
@@ -313,15 +222,7 @@
         <w:spacing w:before="240" w:after="240"/>
       </w:pPr>
       <w:r>
-        <w:t xml:space="preserve">He scratched his head. “Normally we get quartzite from the Wise trade guild, in </w:t>
-      </w:r>
-      <w:proofErr w:type="spellStart"/>
-      <w:r>
-        <w:t>Tethford</w:t>
-      </w:r>
-      <w:proofErr w:type="spellEnd"/>
-      <w:r>
-        <w:t>, roughly 150 miles west following the coastline. Every month, a middleman would come with 5 barrels, and we would pay 300 gold per barrel. However, the supplies stopped roughly 3 months ago. As I can’t personally go outside of the campus, you have to investigate and resolve this issue for us.”</w:t>
+        <w:t>He scratched his head. “Normally we get quartzite from the Wise trade guild, in Tethford, roughly 150 miles west following the coastline. Every month, a middleman would come with 5 barrels, and we would pay 300 gold per barrel. However, the supplies stopped roughly 3 months ago. As I can’t personally go outside of the campus, you have to investigate and resolve this issue for us.”</w:t>
       </w:r>
     </w:p>
     <w:p>
@@ -412,47 +313,23 @@
         <w:spacing w:before="240" w:after="240"/>
       </w:pPr>
       <w:r>
-        <w:t>“</w:t>
-      </w:r>
-      <w:proofErr w:type="spellStart"/>
-      <w:r>
-        <w:t>Mornin</w:t>
-      </w:r>
-      <w:proofErr w:type="spellEnd"/>
-      <w:r>
-        <w:t>’, I am Jacob Wizeman, owner of Wise trading company. It’s been a while since Hevrion contacted us, and by the looks of it, you’re from the adventuring society, yes? I’m surprised there’re still students willing to join that. Thought everyone would call it quits” He laughed.</w:t>
-      </w:r>
-    </w:p>
-    <w:p>
-      <w:pPr>
-        <w:spacing w:before="240" w:after="240"/>
-      </w:pPr>
-      <w:r>
-        <w:t xml:space="preserve">“What’re y’ here for today?” “Ah, the quartzite issue. Let me call someone - Harky! </w:t>
-      </w:r>
-      <w:proofErr w:type="spellStart"/>
-      <w:r>
-        <w:t>Come’ere</w:t>
-      </w:r>
-      <w:proofErr w:type="spellEnd"/>
-      <w:r>
-        <w:t xml:space="preserve"> please!”</w:t>
-      </w:r>
-    </w:p>
-    <w:p>
-      <w:pPr>
-        <w:spacing w:before="240" w:after="240"/>
-      </w:pPr>
-      <w:r>
-        <w:t>“</w:t>
-      </w:r>
-      <w:proofErr w:type="spellStart"/>
-      <w:r>
-        <w:t>Aight</w:t>
-      </w:r>
-      <w:proofErr w:type="spellEnd"/>
-      <w:r>
-        <w:t xml:space="preserve">, let me introduce you to our quartzite middleman, Harky. She’s currently also a ship captain in charge </w:t>
+        <w:t>“Mornin’, I am Jacob Wizeman, owner of Wise trading company. It’s been a while since Hevrion contacted us, and by the looks of it, you’re from the adventuring society, yes? I’m surprised there’re still students willing to join that. Thought everyone would call it quits” He laughed.</w:t>
+      </w:r>
+    </w:p>
+    <w:p>
+      <w:pPr>
+        <w:spacing w:before="240" w:after="240"/>
+      </w:pPr>
+      <w:r>
+        <w:t>“What’re y’ here for today?” “Ah, the quartzite issue. Let me call someone - Harky! Come’ere please!”</w:t>
+      </w:r>
+    </w:p>
+    <w:p>
+      <w:pPr>
+        <w:spacing w:before="240" w:after="240"/>
+      </w:pPr>
+      <w:r>
+        <w:t xml:space="preserve">“Aight, let me introduce you to our quartzite middleman, Harky. She’s currently also a ship captain in charge </w:t>
       </w:r>
       <w:r>
         <w:t>of</w:t>
@@ -504,15 +381,7 @@
         <w:spacing w:before="240" w:after="240"/>
       </w:pPr>
       <w:r>
-        <w:t xml:space="preserve">“Umm you see, there are checkpoints between Hevrion and </w:t>
-      </w:r>
-      <w:proofErr w:type="spellStart"/>
-      <w:r>
-        <w:t>Tethford</w:t>
-      </w:r>
-      <w:proofErr w:type="spellEnd"/>
-      <w:r>
-        <w:t>, and I am forced to pay them a portion of the earnings. Now that we go by the sea, we don’t need to pay for those checkpoints anymore.” Harky said.</w:t>
+        <w:t>“Umm you see, there are checkpoints between Hevrion and Tethford, and I am forced to pay them a portion of the earnings. Now that we go by the sea, we don’t need to pay for those checkpoints anymore.” Harky said.</w:t>
       </w:r>
     </w:p>
     <w:p>
@@ -544,63 +413,31 @@
           <w:b/>
           <w:bCs/>
         </w:rPr>
-        <w:t xml:space="preserve">#1: You recall there is never such checkpoints between Hevrion and </w:t>
-      </w:r>
-      <w:proofErr w:type="spellStart"/>
-      <w:r>
+        <w:t>#1: You recall there is never such checkpoints between Hevrion and Tethford.</w:t>
+      </w:r>
+    </w:p>
+    <w:p>
+      <w:pPr>
+        <w:spacing w:before="240" w:after="240"/>
+      </w:pPr>
+      <w:r>
+        <w:t>“Well, t-they probably disband the checkpoints after we stop paying because it’s not profitable anymore” Harky sweats a bit.</w:t>
+      </w:r>
+    </w:p>
+    <w:p>
+      <w:pPr>
+        <w:spacing w:before="240" w:after="240"/>
         <w:rPr>
           <w:b/>
           <w:bCs/>
         </w:rPr>
-        <w:t>Tethford</w:t>
-      </w:r>
-      <w:proofErr w:type="spellEnd"/>
+      </w:pPr>
       <w:r>
         <w:rPr>
           <w:b/>
           <w:bCs/>
         </w:rPr>
-        <w:t>.</w:t>
-      </w:r>
-    </w:p>
-    <w:p>
-      <w:pPr>
-        <w:spacing w:before="240" w:after="240"/>
-      </w:pPr>
-      <w:r>
-        <w:t>“Well, t-they probably disband the checkpoints after we stop paying because it’s not profitable anymore” Harky sweats a bit.</w:t>
-      </w:r>
-    </w:p>
-    <w:p>
-      <w:pPr>
-        <w:spacing w:before="240" w:after="240"/>
-        <w:rPr>
-          <w:b/>
-          <w:bCs/>
-        </w:rPr>
-      </w:pPr>
-      <w:r>
-        <w:rPr>
-          <w:b/>
-          <w:bCs/>
-        </w:rPr>
-        <w:t xml:space="preserve">#2: (reminder) The caravan that you used to go to </w:t>
-      </w:r>
-      <w:proofErr w:type="spellStart"/>
-      <w:r>
-        <w:rPr>
-          <w:b/>
-          <w:bCs/>
-        </w:rPr>
-        <w:t>Tethford</w:t>
-      </w:r>
-      <w:proofErr w:type="spellEnd"/>
-      <w:r>
-        <w:rPr>
-          <w:b/>
-          <w:bCs/>
-        </w:rPr>
-        <w:t xml:space="preserve"> is full of goods</w:t>
+        <w:t>#2: (reminder) The caravan that you used to go to Tethford is full of goods</w:t>
       </w:r>
     </w:p>
     <w:p>
@@ -646,15 +483,7 @@
         <w:spacing w:before="240" w:after="240"/>
       </w:pPr>
       <w:r>
-        <w:t xml:space="preserve">Harky starts 2 nodes away but hidden and will always move towards the </w:t>
-      </w:r>
-      <w:proofErr w:type="spellStart"/>
-      <w:r>
-        <w:t>harbour</w:t>
-      </w:r>
-      <w:proofErr w:type="spellEnd"/>
-      <w:r>
-        <w:t xml:space="preserve"> using 1 fear. The DM has to keep tabs on her movement and placement. Meanwhile, the players can roll an action to attempt to spot Harky. She will be hidden again by spending 1 fear. Harky will always attempt to </w:t>
+        <w:t xml:space="preserve">Harky starts 2 nodes away but hidden and will always move towards the harbour using 1 fear. The DM has to keep tabs on her movement and placement. Meanwhile, the players can roll an action to attempt to spot Harky. She will be hidden again by spending 1 fear. Harky will always attempt to </w:t>
       </w:r>
       <w:r>
         <w:rPr>
@@ -682,15 +511,7 @@
         <w:spacing w:before="240" w:after="240"/>
       </w:pPr>
       <w:r>
-        <w:t xml:space="preserve">Once Harky reaches ~ 1/3 of the distance to the </w:t>
-      </w:r>
-      <w:proofErr w:type="spellStart"/>
-      <w:r>
-        <w:t>harbour</w:t>
-      </w:r>
-      <w:proofErr w:type="spellEnd"/>
-      <w:r>
-        <w:t>, if no player has spotted him, a blast will go off at her location (she is still hidden). She will be revealed if there is a player on the node. Else, the players will be notified of Harky’s general direction.</w:t>
+        <w:t>Once Harky reaches ~ 1/3 of the distance to the harbour, if no player has spotted him, a blast will go off at her location (she is still hidden). She will be revealed if there is a player on the node. Else, the players will be notified of Harky’s general direction.</w:t>
       </w:r>
     </w:p>
     <w:tbl>
@@ -797,11 +618,9 @@
                   </w:tcMar>
                 </w:tcPr>
                 <w:p>
-                  <w:proofErr w:type="spellStart"/>
                   <w:r>
                     <w:t>Thres</w:t>
                   </w:r>
-                  <w:proofErr w:type="spellEnd"/>
                 </w:p>
               </w:tc>
               <w:tc>
@@ -862,11 +681,9 @@
                   </w:tcMar>
                 </w:tcPr>
                 <w:p>
-                  <w:proofErr w:type="spellStart"/>
                   <w:r>
                     <w:t>Atk</w:t>
                   </w:r>
-                  <w:proofErr w:type="spellEnd"/>
                 </w:p>
               </w:tc>
             </w:tr>
@@ -1023,13 +840,8 @@
               <w:t xml:space="preserve">Cutlass: </w:t>
             </w:r>
             <w:r>
-              <w:t xml:space="preserve">Melee | 1d12+2 </w:t>
-            </w:r>
-            <w:proofErr w:type="spellStart"/>
-            <w:r>
-              <w:t>phy</w:t>
-            </w:r>
-            <w:proofErr w:type="spellEnd"/>
+              <w:t>Melee | 1d12+2 phy</w:t>
+            </w:r>
           </w:p>
           <w:p>
             <w:pPr>
@@ -1047,7 +859,24 @@
               <w:t xml:space="preserve">            </w:t>
             </w:r>
             <w:r>
-              <w:t>Spend 1 fear to move 1 node</w:t>
+              <w:t xml:space="preserve">Spend 1 </w:t>
+            </w:r>
+            <w:r>
+              <w:rPr>
+                <w:b/>
+                <w:bCs/>
+              </w:rPr>
+              <w:t>Fe</w:t>
+            </w:r>
+            <w:r>
+              <w:rPr>
+                <w:b/>
+                <w:bCs/>
+              </w:rPr>
+              <w:t>ar</w:t>
+            </w:r>
+            <w:r>
+              <w:t xml:space="preserve"> to move 1 node</w:t>
             </w:r>
           </w:p>
           <w:p>
@@ -1066,7 +895,24 @@
               <w:t xml:space="preserve">            </w:t>
             </w:r>
             <w:r>
-              <w:t>Spend 1 fear to hide if there is no player on its node</w:t>
+              <w:t xml:space="preserve">Spend 1 </w:t>
+            </w:r>
+            <w:r>
+              <w:rPr>
+                <w:b/>
+                <w:bCs/>
+              </w:rPr>
+              <w:t>F</w:t>
+            </w:r>
+            <w:r>
+              <w:rPr>
+                <w:b/>
+                <w:bCs/>
+              </w:rPr>
+              <w:t>ear</w:t>
+            </w:r>
+            <w:r>
+              <w:t xml:space="preserve"> to hide if there is no player on its node</w:t>
             </w:r>
           </w:p>
           <w:p>
@@ -1085,7 +931,24 @@
               <w:t xml:space="preserve">            </w:t>
             </w:r>
             <w:r>
-              <w:t>Spend 1 stress to throw a Quartzite bomb: Agility reaction roll, 2d4 force damage, stuns for 1 round</w:t>
+              <w:t xml:space="preserve">Spend 1 </w:t>
+            </w:r>
+            <w:r>
+              <w:rPr>
+                <w:b/>
+                <w:bCs/>
+              </w:rPr>
+              <w:t>S</w:t>
+            </w:r>
+            <w:r>
+              <w:rPr>
+                <w:b/>
+                <w:bCs/>
+              </w:rPr>
+              <w:t>tress</w:t>
+            </w:r>
+            <w:r>
+              <w:t xml:space="preserve"> to throw a Quartzite bomb: Agility reaction roll, 2d4 force damage, stuns for 1 round</w:t>
             </w:r>
           </w:p>
           <w:p>
@@ -1110,7 +973,25 @@
                 <w:i/>
                 <w:iCs/>
               </w:rPr>
-              <w:t xml:space="preserve">Reinforcements: </w:t>
+              <w:t>Reinforcements</w:t>
+            </w:r>
+            <w:r>
+              <w:rPr>
+                <w:b/>
+                <w:bCs/>
+                <w:i/>
+                <w:iCs/>
+              </w:rPr>
+              <w:t xml:space="preserve"> - Passive</w:t>
+            </w:r>
+            <w:r>
+              <w:rPr>
+                <w:b/>
+                <w:bCs/>
+                <w:i/>
+                <w:iCs/>
+              </w:rPr>
+              <w:t xml:space="preserve">: </w:t>
             </w:r>
             <w:r>
               <w:t xml:space="preserve">Once after HP drops below 4, </w:t>
@@ -1233,15 +1114,7 @@
         <w:spacing w:before="240" w:after="240"/>
       </w:pPr>
       <w:r>
-        <w:t xml:space="preserve">If Harky reaches the </w:t>
-      </w:r>
-      <w:proofErr w:type="spellStart"/>
-      <w:r>
-        <w:t>harbour</w:t>
-      </w:r>
-      <w:proofErr w:type="spellEnd"/>
-      <w:r>
-        <w:t>:</w:t>
+        <w:t>If Harky reaches the harbour:</w:t>
       </w:r>
     </w:p>
     <w:p>
@@ -1335,28 +1208,15 @@
         <w:spacing w:before="240" w:after="240"/>
       </w:pPr>
       <w:r>
-        <w:t xml:space="preserve">Principal welcomes back the party with </w:t>
-      </w:r>
-      <w:proofErr w:type="spellStart"/>
-      <w:r>
-        <w:t>Ms</w:t>
-      </w:r>
-      <w:proofErr w:type="spellEnd"/>
-      <w:r>
-        <w:t xml:space="preserve"> Sapphire</w:t>
-      </w:r>
-    </w:p>
-    <w:p>
-      <w:pPr>
-        <w:spacing w:before="240" w:after="240"/>
-      </w:pPr>
-      <w:proofErr w:type="spellStart"/>
-      <w:r>
-        <w:t>Ms</w:t>
-      </w:r>
-      <w:proofErr w:type="spellEnd"/>
-      <w:r>
-        <w:t xml:space="preserve"> Sapphire hugs the barrels of quartzite. Ahem, thank you, thank you for this! Ah, as repayment, you can contact us if you need any equipment repaired, or if you want to create magical stuff!</w:t>
+        <w:t>Principal welcomes back the party with Ms Sapphire</w:t>
+      </w:r>
+    </w:p>
+    <w:p>
+      <w:pPr>
+        <w:spacing w:before="240" w:after="240"/>
+      </w:pPr>
+      <w:r>
+        <w:t>Ms Sapphire hugs the barrels of quartzite. Ahem, thank you, thank you for this! Ah, as repayment, you can contact us if you need any equipment repaired, or if you want to create magical stuff!</w:t>
       </w:r>
     </w:p>
     <w:p>

</xml_diff>

<commit_message>
Attempt to fix the image breaking github
</commit_message>
<xml_diff>
--- a/content/storylines/Vrey-Prelude-of-Fear/Chapter_1.docx
+++ b/content/storylines/Vrey-Prelude-of-Fear/Chapter_1.docx
@@ -19,8 +19,8 @@
           <w:noProof/>
         </w:rPr>
         <w:drawing>
-          <wp:inline distT="0" distB="0" distL="0" distR="0" wp14:anchorId="374085EB" wp14:editId="37C97013">
-            <wp:extent cx="2857500" cy="1600200"/>
+          <wp:inline distT="0" distB="0" distL="0" distR="0" wp14:anchorId="374085EB" wp14:editId="5A779A10">
+            <wp:extent cx="3034393" cy="1699260"/>
             <wp:effectExtent l="0" t="0" r="0" b="0"/>
             <wp:docPr id="702293012" name="Picture 1" descr="Video Testing Images | PLSN"/>
             <wp:cNvGraphicFramePr>
@@ -51,7 +51,7 @@
                   <pic:spPr bwMode="auto">
                     <a:xfrm>
                       <a:off x="0" y="0"/>
-                      <a:ext cx="2857500" cy="1600200"/>
+                      <a:ext cx="3036500" cy="1700440"/>
                     </a:xfrm>
                     <a:prstGeom prst="rect">
                       <a:avLst/>
@@ -91,7 +91,15 @@
         <w:spacing w:before="240" w:after="240"/>
       </w:pPr>
       <w:r>
-        <w:t>It’s a new academic year! Congratulations to all freshies, who got into the prestigious Hevrion magic campus, and not only that, accepted a once in a lifetime offer of membership to an extracurricular activity called ‘Hevrion Adventuring Society’. Now, all of you, along with all other academicians, new and old, arrived in the campus’ amphitheatre and sat in your marble seats adorned with beautiful engravings of heroes.</w:t>
+        <w:t xml:space="preserve">It’s a new academic year! Congratulations to all freshies, who got into the prestigious Hevrion magic campus, and not only that, accepted a once in a lifetime offer of membership to an extracurricular activity called ‘Hevrion Adventuring Society’. Now, all of you, along with all other academicians, new and old, arrived in the campus’ </w:t>
+      </w:r>
+      <w:proofErr w:type="spellStart"/>
+      <w:r>
+        <w:t>amphitheatre</w:t>
+      </w:r>
+      <w:proofErr w:type="spellEnd"/>
+      <w:r>
+        <w:t xml:space="preserve"> and sat in your marble seats adorned with beautiful engravings of heroes.</w:t>
       </w:r>
     </w:p>
     <w:p>
@@ -101,39 +109,96 @@
       <w:r>
         <w:t xml:space="preserve">Above the stage, a fire burns bright on top of an altar. Below it stood a half-elf, tapping his fingers on some kind of device. “Hello…, hello? Ah, the </w:t>
       </w:r>
+      <w:proofErr w:type="spellStart"/>
       <w:r>
         <w:rPr>
           <w:i/>
           <w:iCs/>
         </w:rPr>
-        <w:t xml:space="preserve">Tonverstärker* </w:t>
-      </w:r>
-      <w:r>
-        <w:t>is not working again. Ms Sapphire, this magic device is broken again. I know the maintenance is costly, but can we at least ensure it is working before crucial ceremonies please? “</w:t>
-      </w:r>
-    </w:p>
-    <w:p>
-      <w:pPr>
-        <w:spacing w:before="240" w:after="240"/>
-      </w:pPr>
-      <w:r>
-        <w:t>Behind him, multiple people with different coloured robes sat on their respective tables. Amongst them, someone stands up. She has a horn adorned with what you presume are jewelleries. She has a long nose and dropping ears on her white, furry face, with a large black path covering her right cheek and chin. She adorns a gray robe with intricate gold lines forming patterns. Ms Sapphire bows to the man on the podium with an annoyed grin (RBF) and sits back down. The man smiles and nods in return.</w:t>
-      </w:r>
-    </w:p>
-    <w:p>
-      <w:pPr>
-        <w:spacing w:before="240" w:after="240"/>
-      </w:pPr>
-      <w:r>
-        <w:t>He then opened one of his pouches on his waist and took some small plants from it. He mumbles some chant while crushing the herbs, performs some hand gestures that you don’t yet understand, and touches his neck.</w:t>
-      </w:r>
-    </w:p>
-    <w:p>
-      <w:pPr>
-        <w:spacing w:before="240" w:after="240"/>
-      </w:pPr>
-      <w:r>
-        <w:t>“1,2,3, 1,2,3 Testing, testing, 1,2,3”  [STARTS LOUD, and followed by hand movements]</w:t>
+        <w:t>Tonverstärker</w:t>
+      </w:r>
+      <w:proofErr w:type="spellEnd"/>
+      <w:r>
+        <w:rPr>
+          <w:i/>
+          <w:iCs/>
+        </w:rPr>
+        <w:t xml:space="preserve">* </w:t>
+      </w:r>
+      <w:r>
+        <w:t xml:space="preserve">is not working again. </w:t>
+      </w:r>
+      <w:proofErr w:type="spellStart"/>
+      <w:r>
+        <w:t>Ms</w:t>
+      </w:r>
+      <w:proofErr w:type="spellEnd"/>
+      <w:r>
+        <w:t xml:space="preserve"> Sapphire, this magic device is broken again. I know the maintenance is costly, but can we at least ensure it is working before crucial ceremonies please? “</w:t>
+      </w:r>
+    </w:p>
+    <w:p>
+      <w:pPr>
+        <w:spacing w:before="240" w:after="240"/>
+      </w:pPr>
+      <w:r>
+        <w:t xml:space="preserve">Behind him, multiple people with different </w:t>
+      </w:r>
+      <w:proofErr w:type="spellStart"/>
+      <w:r>
+        <w:t>coloured</w:t>
+      </w:r>
+      <w:proofErr w:type="spellEnd"/>
+      <w:r>
+        <w:t xml:space="preserve"> robes sat on their respective tables. Amongst them, someone stands up. She has a horn adorned with what you presume are </w:t>
+      </w:r>
+      <w:proofErr w:type="spellStart"/>
+      <w:r>
+        <w:t>jewelleries</w:t>
+      </w:r>
+      <w:proofErr w:type="spellEnd"/>
+      <w:r>
+        <w:t xml:space="preserve">. She has a long nose and dropping ears on her white, furry face, with a large black path covering her right cheek and chin. She adorns a gray robe with intricate gold lines forming patterns. </w:t>
+      </w:r>
+      <w:proofErr w:type="spellStart"/>
+      <w:r>
+        <w:t>Ms</w:t>
+      </w:r>
+      <w:proofErr w:type="spellEnd"/>
+      <w:r>
+        <w:t xml:space="preserve"> Sapphire bows to the man on the podium with an annoyed grin (RBF) and sits back down. The man smiles and nods in return.</w:t>
+      </w:r>
+    </w:p>
+    <w:p>
+      <w:pPr>
+        <w:spacing w:before="240" w:after="240"/>
+      </w:pPr>
+      <w:r>
+        <w:t xml:space="preserve">He then opened one of his pouches on his waist and took some small plants from it. He mumbles some </w:t>
+      </w:r>
+      <w:proofErr w:type="gramStart"/>
+      <w:r>
+        <w:t>chant</w:t>
+      </w:r>
+      <w:proofErr w:type="gramEnd"/>
+      <w:r>
+        <w:t xml:space="preserve"> while crushing the herbs, performs some hand gestures that you don’t yet understand, and touches his neck.</w:t>
+      </w:r>
+    </w:p>
+    <w:p>
+      <w:pPr>
+        <w:spacing w:before="240" w:after="240"/>
+      </w:pPr>
+      <w:r>
+        <w:t>“1,2,3, 1,2,3 Testing, testing, 1,2,</w:t>
+      </w:r>
+      <w:proofErr w:type="gramStart"/>
+      <w:r>
+        <w:t>3”  [</w:t>
+      </w:r>
+      <w:proofErr w:type="gramEnd"/>
+      <w:r>
+        <w:t>STARTS LOUD, and followed by hand movements]</w:t>
       </w:r>
     </w:p>
     <w:p>
@@ -167,7 +232,23 @@
         <w:spacing w:before="240" w:after="240"/>
       </w:pPr>
       <w:r>
-        <w:t>“Every year, many students from all paths of life will be invited to the campus. Thus, I would like to reiterate that everyone here should be treated with equal respect, no matter the background. Most importantly, new and old students, I hope all of you will learn and continue to grow throughout your lives.” He continued talking about the curriculum and other administrative matters for a minute or two and finished his speech with thanks. He bows to a certain direction (the princes and princess) in the crowd, then walks off stage and before you know it, he disappears.</w:t>
+        <w:t xml:space="preserve">“Every year, many students from all paths of life will be invited to the campus. Thus, I would like to reiterate that everyone here should be treated with equal respect, no </w:t>
+      </w:r>
+      <w:proofErr w:type="gramStart"/>
+      <w:r>
+        <w:t>matter</w:t>
+      </w:r>
+      <w:proofErr w:type="gramEnd"/>
+      <w:r>
+        <w:t xml:space="preserve"> the background. Most importantly, new and old students, I hope all of you will learn and continue to grow throughout your lives.” He continued talking about the curriculum and other administrative matters for a minute or two and finished his speech with thanks. He bows </w:t>
+      </w:r>
+      <w:proofErr w:type="gramStart"/>
+      <w:r>
+        <w:t>to</w:t>
+      </w:r>
+      <w:proofErr w:type="gramEnd"/>
+      <w:r>
+        <w:t xml:space="preserve"> a certain direction (the princes and princess) in the crowd, then walks off stage and before you know it, he disappears.</w:t>
       </w:r>
     </w:p>
     <w:p>
@@ -185,6 +266,7 @@
       <w:r>
         <w:t xml:space="preserve">“Ah, I almost forgot. If you have questions, you can approach the teachers. Also Remember to submit your </w:t>
       </w:r>
+      <w:proofErr w:type="spellStart"/>
       <w:r>
         <w:rPr>
           <w:i/>
@@ -192,8 +274,17 @@
         </w:rPr>
         <w:t>societa</w:t>
       </w:r>
-      <w:r>
-        <w:t xml:space="preserve"> (club) form and your course in 3 days. Adventuring society members, please meet me at my office after this.” You can hear the same voice of the principal despite him not being present anymore, before you hear a beep sound and silence.</w:t>
+      <w:proofErr w:type="spellEnd"/>
+      <w:r>
+        <w:t xml:space="preserve"> (club) form and your course in 3 days. Adventuring society members, please meet me at my office after this.” You can hear the same voice </w:t>
+      </w:r>
+      <w:proofErr w:type="gramStart"/>
+      <w:r>
+        <w:t>of</w:t>
+      </w:r>
+      <w:proofErr w:type="gramEnd"/>
+      <w:r>
+        <w:t xml:space="preserve"> the principal despite him not being present anymore, before you hear a beep sound and silence.</w:t>
       </w:r>
     </w:p>
     <w:p>
@@ -209,7 +300,15 @@
         <w:spacing w:before="240" w:after="240"/>
       </w:pPr>
       <w:r>
-        <w:t>From the gaps on the ceiling of the amphitheatre, you can see a tall, distinctive tower. You instinctively know that there lies your next destination.</w:t>
+        <w:t xml:space="preserve">From the gaps on the ceiling of the </w:t>
+      </w:r>
+      <w:proofErr w:type="spellStart"/>
+      <w:r>
+        <w:t>amphitheatre</w:t>
+      </w:r>
+      <w:proofErr w:type="spellEnd"/>
+      <w:r>
+        <w:t>, you can see a tall, distinctive tower. You instinctively know that there lies your next destination.</w:t>
       </w:r>
     </w:p>
     <w:p>
@@ -225,7 +324,31 @@
         <w:spacing w:before="240" w:after="240"/>
       </w:pPr>
       <w:r>
-        <w:t>[Nguingggg (undertale lift sfx)] There are two rooms in front of you. On the left is the principal’s office, and on the right, a wooden door with a plaque that says: HAS. (it’s locked)</w:t>
+        <w:t>[</w:t>
+      </w:r>
+      <w:proofErr w:type="spellStart"/>
+      <w:r>
+        <w:t>Nguingggg</w:t>
+      </w:r>
+      <w:proofErr w:type="spellEnd"/>
+      <w:r>
+        <w:t xml:space="preserve"> (</w:t>
+      </w:r>
+      <w:proofErr w:type="spellStart"/>
+      <w:r>
+        <w:t>undertale</w:t>
+      </w:r>
+      <w:proofErr w:type="spellEnd"/>
+      <w:r>
+        <w:t xml:space="preserve"> lift </w:t>
+      </w:r>
+      <w:proofErr w:type="spellStart"/>
+      <w:r>
+        <w:t>sfx</w:t>
+      </w:r>
+      <w:proofErr w:type="spellEnd"/>
+      <w:r>
+        <w:t>)] There are two rooms in front of you. On the left is the principal’s office, and on the right, a wooden door with a plaque that says: HAS. (it’s locked)</w:t>
       </w:r>
     </w:p>
     <w:p>
@@ -241,7 +364,39 @@
         <w:spacing w:before="240" w:after="240"/>
       </w:pPr>
       <w:r>
-        <w:t>The interior is outlined with many books and stacks and stacks of parchments. One of the stacks almost completely covers an expensive looking table in the middle of the office. But the principle is not behind this table. You spot the principal sitting on the floor, in the corner of his office almost buried in the middle of a pile of papers. “Oh! Welcome, welcome.” The piles of papers float beside him and fall down in an organised manner, while he stands and walk to a counter with a stack of cups and clay (kettle? Kendi). “Tea or coffee?”  [Pours something on an empty cup] “Wrong, it’s []” [slurps] “Ah, please help yourself (idk if this is the correct expression). Other than [], we have [the other one], milk, wine, fermented apples, and coconut.” [points to the counter while sipping].</w:t>
+        <w:t xml:space="preserve">The interior is outlined with many books and stacks and stacks of parchments. One of the stacks almost completely covers an expensive looking table in the middle of the office. But the principle is not behind this table. You spot the principal sitting on the floor, in the corner of his office almost buried in the middle of a pile of papers. “Oh! Welcome, welcome.” The piles of papers float beside him and </w:t>
+      </w:r>
+      <w:proofErr w:type="gramStart"/>
+      <w:r>
+        <w:t>fall down</w:t>
+      </w:r>
+      <w:proofErr w:type="gramEnd"/>
+      <w:r>
+        <w:t xml:space="preserve"> in an </w:t>
+      </w:r>
+      <w:proofErr w:type="spellStart"/>
+      <w:r>
+        <w:t>organised</w:t>
+      </w:r>
+      <w:proofErr w:type="spellEnd"/>
+      <w:r>
+        <w:t xml:space="preserve"> manner, while he stands and </w:t>
+      </w:r>
+      <w:proofErr w:type="gramStart"/>
+      <w:r>
+        <w:t>walk</w:t>
+      </w:r>
+      <w:proofErr w:type="gramEnd"/>
+      <w:r>
+        <w:t xml:space="preserve"> to a counter with a stack of cups and </w:t>
+      </w:r>
+      <w:proofErr w:type="gramStart"/>
+      <w:r>
+        <w:t>clay (kettle?</w:t>
+      </w:r>
+      <w:proofErr w:type="gramEnd"/>
+      <w:r>
+        <w:t xml:space="preserve"> Kendi). “Tea or coffee?”  [Pours something on an empty cup] “Wrong, it’s []” [slurps] “Ah, please help yourself (idk if this is the correct expression). Other than [], we have [the other one], milk, wine, fermented apples, and coconut.” [points to the counter while sipping].</w:t>
       </w:r>
     </w:p>
     <w:p>
@@ -269,23 +424,55 @@
         <w:spacing w:before="240" w:after="240"/>
       </w:pPr>
       <w:r>
-        <w:t>You see a blue, floating, somewhat invisible hand stretching a detailed map on the air in front of you.</w:t>
-      </w:r>
-    </w:p>
-    <w:p>
-      <w:pPr>
-        <w:spacing w:before="240" w:after="240"/>
-      </w:pPr>
-      <w:r>
-        <w:t>He scratched his head. “Normally we get quartzite from the Wise trade guild, in Tethford, roughly 150 miles west following the coastline. Every month, a middleman would come with 5 barrels, and we would pay 300 gold per barrel. However, the supplies stopped roughly 3 months ago. As I can’t personally go outside of the campus, you have to investigate and resolve this issue for us.”</w:t>
-      </w:r>
-    </w:p>
-    <w:p>
-      <w:pPr>
-        <w:spacing w:before="240" w:after="240"/>
-      </w:pPr>
-      <w:r>
-        <w:t>“Take this ring. You can access HAS budget through that ring. If you need any equipment, you can use the ring to open your club room just next door and take almost anything. Do not touch the shelf, those items are of no use for you. For the reward, that’ll depend on your report and performance. “</w:t>
+        <w:t xml:space="preserve">You see a blue, floating, somewhat invisible hand stretching a detailed map </w:t>
+      </w:r>
+      <w:proofErr w:type="gramStart"/>
+      <w:r>
+        <w:t>on</w:t>
+      </w:r>
+      <w:proofErr w:type="gramEnd"/>
+      <w:r>
+        <w:t xml:space="preserve"> the air in front of you.</w:t>
+      </w:r>
+    </w:p>
+    <w:p>
+      <w:pPr>
+        <w:spacing w:before="240" w:after="240"/>
+      </w:pPr>
+      <w:r>
+        <w:t xml:space="preserve">He scratched his head. “Normally we get quartzite from the Wise trade guild, in </w:t>
+      </w:r>
+      <w:proofErr w:type="spellStart"/>
+      <w:r>
+        <w:t>Tethford</w:t>
+      </w:r>
+      <w:proofErr w:type="spellEnd"/>
+      <w:r>
+        <w:t xml:space="preserve">, roughly 150 miles west following the coastline. Every month, a middleman would come with 5 barrels, and we would pay 300 gold per barrel. However, the supplies stopped roughly 3 months ago. As I can’t personally go outside of the campus, you </w:t>
+      </w:r>
+      <w:proofErr w:type="gramStart"/>
+      <w:r>
+        <w:t>have to</w:t>
+      </w:r>
+      <w:proofErr w:type="gramEnd"/>
+      <w:r>
+        <w:t xml:space="preserve"> investigate and resolve this issue for us.”</w:t>
+      </w:r>
+    </w:p>
+    <w:p>
+      <w:pPr>
+        <w:spacing w:before="240" w:after="240"/>
+      </w:pPr>
+      <w:r>
+        <w:t xml:space="preserve">“Take this ring. You can access HAS budget through that ring. If you need any equipment, you can use the ring to open your club room just next door and take almost anything. Do not touch the shelf, those items are of no use </w:t>
+      </w:r>
+      <w:proofErr w:type="gramStart"/>
+      <w:r>
+        <w:t>for</w:t>
+      </w:r>
+      <w:proofErr w:type="gramEnd"/>
+      <w:r>
+        <w:t xml:space="preserve"> you. For the reward, that’ll depend on your report and performance. “</w:t>
       </w:r>
     </w:p>
     <w:p>
@@ -309,7 +496,15 @@
         <w:spacing w:before="240" w:after="240"/>
       </w:pPr>
       <w:r>
-        <w:t>Caravan full with goods</w:t>
+        <w:t xml:space="preserve">Caravan full </w:t>
+      </w:r>
+      <w:proofErr w:type="gramStart"/>
+      <w:r>
+        <w:t>with</w:t>
+      </w:r>
+      <w:proofErr w:type="gramEnd"/>
+      <w:r>
+        <w:t xml:space="preserve"> goods</w:t>
       </w:r>
     </w:p>
     <w:p>
@@ -368,23 +563,55 @@
         <w:spacing w:before="240" w:after="240"/>
       </w:pPr>
       <w:r>
-        <w:t>“Mornin’, I am Jacob Wizeman, owner of Wise trading company. It’s been a while since Hevrion contacted us, and by the looks of it, you’re from the adventuring society, yes? I’m surprised there’re still students willing to join that. Thought everyone would call it quits” He laughed.</w:t>
-      </w:r>
-    </w:p>
-    <w:p>
-      <w:pPr>
-        <w:spacing w:before="240" w:after="240"/>
-      </w:pPr>
-      <w:r>
-        <w:t>“What’re y’ here for today?” “Ah, the quartzite issue. Let me call someone - Harky! Come’ere please!”</w:t>
-      </w:r>
-    </w:p>
-    <w:p>
-      <w:pPr>
-        <w:spacing w:before="240" w:after="240"/>
-      </w:pPr>
-      <w:r>
-        <w:t xml:space="preserve">“Aight, let me introduce you to our quartzite middleman, Harky. She’s currently also a ship captain in charge </w:t>
+        <w:t>“</w:t>
+      </w:r>
+      <w:proofErr w:type="spellStart"/>
+      <w:r>
+        <w:t>Mornin</w:t>
+      </w:r>
+      <w:proofErr w:type="spellEnd"/>
+      <w:r>
+        <w:t xml:space="preserve">’, I am Jacob Wizeman, owner of Wise trading company. It’s been a while since Hevrion contacted us, and by the looks of it, you’re from the adventuring society, yes? I’m surprised there’re still students willing to join that. </w:t>
+      </w:r>
+      <w:proofErr w:type="gramStart"/>
+      <w:r>
+        <w:t>Thought everyone would call it quits” He</w:t>
+      </w:r>
+      <w:proofErr w:type="gramEnd"/>
+      <w:r>
+        <w:t xml:space="preserve"> laughed.</w:t>
+      </w:r>
+    </w:p>
+    <w:p>
+      <w:pPr>
+        <w:spacing w:before="240" w:after="240"/>
+      </w:pPr>
+      <w:r>
+        <w:t xml:space="preserve">“What’re y’ here for today?” “Ah, the quartzite issue. Let me call someone - Harky! </w:t>
+      </w:r>
+      <w:proofErr w:type="spellStart"/>
+      <w:r>
+        <w:t>Come’ere</w:t>
+      </w:r>
+      <w:proofErr w:type="spellEnd"/>
+      <w:r>
+        <w:t xml:space="preserve"> please!”</w:t>
+      </w:r>
+    </w:p>
+    <w:p>
+      <w:pPr>
+        <w:spacing w:before="240" w:after="240"/>
+      </w:pPr>
+      <w:r>
+        <w:t>“</w:t>
+      </w:r>
+      <w:proofErr w:type="spellStart"/>
+      <w:r>
+        <w:t>Aight</w:t>
+      </w:r>
+      <w:proofErr w:type="spellEnd"/>
+      <w:r>
+        <w:t xml:space="preserve">, let me introduce you to our quartzite middleman, Harky. She’s currently also a ship captain in charge </w:t>
       </w:r>
       <w:r>
         <w:t>of</w:t>
@@ -436,7 +663,15 @@
         <w:spacing w:before="240" w:after="240"/>
       </w:pPr>
       <w:r>
-        <w:t>“Umm you see, there are checkpoints between Hevrion and Tethford, and I am forced to pay them a portion of the earnings. Now that we go by the sea, we don’t need to pay for those checkpoints anymore.” Harky said.</w:t>
+        <w:t xml:space="preserve">“Umm you see, there are checkpoints between Hevrion and </w:t>
+      </w:r>
+      <w:proofErr w:type="spellStart"/>
+      <w:r>
+        <w:t>Tethford</w:t>
+      </w:r>
+      <w:proofErr w:type="spellEnd"/>
+      <w:r>
+        <w:t>, and I am forced to pay them a portion of the earnings. Now that we go by the sea, we don’t need to pay for those checkpoints anymore.” Harky said.</w:t>
       </w:r>
     </w:p>
     <w:p>
@@ -452,31 +687,23 @@
           <w:b/>
           <w:bCs/>
         </w:rPr>
-        <w:t>Change into an action roll if the story isn’t going anywhere: If a player recalls that there are no checkpoints / (12) history check / (8) history check (for certain players) #1 / (16) history check #2:</w:t>
-      </w:r>
-    </w:p>
-    <w:p>
-      <w:pPr>
-        <w:spacing w:before="240" w:after="240"/>
+        <w:t xml:space="preserve">Change into an action roll if the story isn’t going anywhere: If a player recalls that there are no checkpoints / (12) history check / (8) history check (for certain </w:t>
+      </w:r>
+      <w:proofErr w:type="gramStart"/>
+      <w:r>
         <w:rPr>
           <w:b/>
           <w:bCs/>
         </w:rPr>
-      </w:pPr>
+        <w:t>players) #</w:t>
+      </w:r>
+      <w:proofErr w:type="gramEnd"/>
       <w:r>
         <w:rPr>
           <w:b/>
           <w:bCs/>
         </w:rPr>
-        <w:t>#1: You recall there is never such checkpoints between Hevrion and Tethford.</w:t>
-      </w:r>
-    </w:p>
-    <w:p>
-      <w:pPr>
-        <w:spacing w:before="240" w:after="240"/>
-      </w:pPr>
-      <w:r>
-        <w:t>“Well, t-they probably disband the checkpoints after we stop paying because it’s not profitable anymore” Harky sweats a bit.</w:t>
+        <w:t>1 / (16) history check #2:</w:t>
       </w:r>
     </w:p>
     <w:p>
@@ -492,15 +719,95 @@
           <w:b/>
           <w:bCs/>
         </w:rPr>
-        <w:t>#2: (reminder) The caravan that you used to go to Tethford is full of goods</w:t>
-      </w:r>
-    </w:p>
-    <w:p>
-      <w:pPr>
-        <w:spacing w:before="240" w:after="240"/>
-      </w:pPr>
-      <w:r>
-        <w:t>“Si-sir, I have another urgent matter – please excuse me!!!” Harky darts out of the meeting room.</w:t>
+        <w:t xml:space="preserve">#1: You recall there </w:t>
+      </w:r>
+      <w:proofErr w:type="gramStart"/>
+      <w:r>
+        <w:rPr>
+          <w:b/>
+          <w:bCs/>
+        </w:rPr>
+        <w:t>is</w:t>
+      </w:r>
+      <w:proofErr w:type="gramEnd"/>
+      <w:r>
+        <w:rPr>
+          <w:b/>
+          <w:bCs/>
+        </w:rPr>
+        <w:t xml:space="preserve"> never such checkpoints between Hevrion and </w:t>
+      </w:r>
+      <w:proofErr w:type="spellStart"/>
+      <w:r>
+        <w:rPr>
+          <w:b/>
+          <w:bCs/>
+        </w:rPr>
+        <w:t>Tethford</w:t>
+      </w:r>
+      <w:proofErr w:type="spellEnd"/>
+      <w:r>
+        <w:rPr>
+          <w:b/>
+          <w:bCs/>
+        </w:rPr>
+        <w:t>.</w:t>
+      </w:r>
+    </w:p>
+    <w:p>
+      <w:pPr>
+        <w:spacing w:before="240" w:after="240"/>
+      </w:pPr>
+      <w:r>
+        <w:t>“Well, t-they probably disband the checkpoints after we stop paying because it’s not profitable anymore” Harky sweats a bit.</w:t>
+      </w:r>
+    </w:p>
+    <w:p>
+      <w:pPr>
+        <w:spacing w:before="240" w:after="240"/>
+        <w:rPr>
+          <w:b/>
+          <w:bCs/>
+        </w:rPr>
+      </w:pPr>
+      <w:r>
+        <w:rPr>
+          <w:b/>
+          <w:bCs/>
+        </w:rPr>
+        <w:t xml:space="preserve">#2: (reminder) The caravan that you used to go to </w:t>
+      </w:r>
+      <w:proofErr w:type="spellStart"/>
+      <w:r>
+        <w:rPr>
+          <w:b/>
+          <w:bCs/>
+        </w:rPr>
+        <w:t>Tethford</w:t>
+      </w:r>
+      <w:proofErr w:type="spellEnd"/>
+      <w:r>
+        <w:rPr>
+          <w:b/>
+          <w:bCs/>
+        </w:rPr>
+        <w:t xml:space="preserve"> is full of goods</w:t>
+      </w:r>
+    </w:p>
+    <w:p>
+      <w:pPr>
+        <w:spacing w:before="240" w:after="240"/>
+      </w:pPr>
+      <w:r>
+        <w:t>“</w:t>
+      </w:r>
+      <w:proofErr w:type="gramStart"/>
+      <w:r>
+        <w:t>Si-sir</w:t>
+      </w:r>
+      <w:proofErr w:type="gramEnd"/>
+      <w:r>
+        <w:t>, I have another urgent matter – please excuse me!!!” Harky darts out of the meeting room.</w:t>
       </w:r>
     </w:p>
     <w:p>
@@ -538,7 +845,23 @@
         <w:spacing w:before="240" w:after="240"/>
       </w:pPr>
       <w:r>
-        <w:t xml:space="preserve">Harky starts 2 nodes away but hidden and will always move towards the harbour using 1 fear. The DM has to keep tabs on her movement and placement. Meanwhile, the players can roll an action to attempt to spot Harky. She will be hidden again by spending 1 fear. Harky will always attempt to </w:t>
+        <w:t xml:space="preserve">Harky starts 2 nodes away but hidden and will always move towards the </w:t>
+      </w:r>
+      <w:proofErr w:type="spellStart"/>
+      <w:r>
+        <w:t>harbour</w:t>
+      </w:r>
+      <w:proofErr w:type="spellEnd"/>
+      <w:r>
+        <w:t xml:space="preserve"> using 1 fear. The DM </w:t>
+      </w:r>
+      <w:proofErr w:type="gramStart"/>
+      <w:r>
+        <w:t>has to</w:t>
+      </w:r>
+      <w:proofErr w:type="gramEnd"/>
+      <w:r>
+        <w:t xml:space="preserve"> keep tabs on her movement and placement. Meanwhile, the players can roll an action to attempt to spot Harky. She will be hidden again by spending 1 fear. Harky will always attempt to </w:t>
       </w:r>
       <w:r>
         <w:rPr>
@@ -566,7 +889,15 @@
         <w:spacing w:before="240" w:after="240"/>
       </w:pPr>
       <w:r>
-        <w:t>Once Harky reaches ~ 1/3 of the distance to the harbour, if no player has spotted him, a blast will go off at her location (she is still hidden). She will be revealed if there is a player on the node. Else, the players will be notified of Harky’s general direction.</w:t>
+        <w:t xml:space="preserve">Once Harky reaches ~ 1/3 of the distance to the </w:t>
+      </w:r>
+      <w:proofErr w:type="spellStart"/>
+      <w:r>
+        <w:t>harbour</w:t>
+      </w:r>
+      <w:proofErr w:type="spellEnd"/>
+      <w:r>
+        <w:t>, if no player has spotted him, a blast will go off at her location (she is still hidden). She will be revealed if there is a player on the node. Else, the players will be notified of Harky’s general direction.</w:t>
       </w:r>
     </w:p>
     <w:tbl>
@@ -673,9 +1004,11 @@
                   </w:tcMar>
                 </w:tcPr>
                 <w:p>
+                  <w:proofErr w:type="spellStart"/>
                   <w:r>
                     <w:t>Thres</w:t>
                   </w:r>
+                  <w:proofErr w:type="spellEnd"/>
                 </w:p>
               </w:tc>
               <w:tc>
@@ -736,9 +1069,11 @@
                   </w:tcMar>
                 </w:tcPr>
                 <w:p>
+                  <w:proofErr w:type="spellStart"/>
                   <w:r>
                     <w:t>Atk</w:t>
                   </w:r>
+                  <w:proofErr w:type="spellEnd"/>
                 </w:p>
               </w:tc>
             </w:tr>
@@ -895,8 +1230,13 @@
               <w:t xml:space="preserve">Cutlass: </w:t>
             </w:r>
             <w:r>
-              <w:t>Melee | 1d12+2 phy</w:t>
-            </w:r>
+              <w:t xml:space="preserve">Melee | 1d12+2 </w:t>
+            </w:r>
+            <w:proofErr w:type="spellStart"/>
+            <w:r>
+              <w:t>phy</w:t>
+            </w:r>
+            <w:proofErr w:type="spellEnd"/>
           </w:p>
           <w:p>
             <w:pPr>
@@ -1169,7 +1509,15 @@
         <w:spacing w:before="240" w:after="240"/>
       </w:pPr>
       <w:r>
-        <w:t>If Harky reaches the harbour:</w:t>
+        <w:t xml:space="preserve">If Harky reaches the </w:t>
+      </w:r>
+      <w:proofErr w:type="spellStart"/>
+      <w:r>
+        <w:t>harbour</w:t>
+      </w:r>
+      <w:proofErr w:type="spellEnd"/>
+      <w:r>
+        <w:t>:</w:t>
       </w:r>
     </w:p>
     <w:p>
@@ -1263,15 +1611,28 @@
         <w:spacing w:before="240" w:after="240"/>
       </w:pPr>
       <w:r>
-        <w:t>Principal welcomes back the party with Ms Sapphire</w:t>
-      </w:r>
-    </w:p>
-    <w:p>
-      <w:pPr>
-        <w:spacing w:before="240" w:after="240"/>
-      </w:pPr>
-      <w:r>
-        <w:t>Ms Sapphire hugs the barrels of quartzite. Ahem, thank you, thank you for this! Ah, as repayment, you can contact us if you need any equipment repaired, or if you want to create magical stuff!</w:t>
+        <w:t xml:space="preserve">Principal welcomes back the party with </w:t>
+      </w:r>
+      <w:proofErr w:type="spellStart"/>
+      <w:r>
+        <w:t>Ms</w:t>
+      </w:r>
+      <w:proofErr w:type="spellEnd"/>
+      <w:r>
+        <w:t xml:space="preserve"> Sapphire</w:t>
+      </w:r>
+    </w:p>
+    <w:p>
+      <w:pPr>
+        <w:spacing w:before="240" w:after="240"/>
+      </w:pPr>
+      <w:proofErr w:type="spellStart"/>
+      <w:r>
+        <w:t>Ms</w:t>
+      </w:r>
+      <w:proofErr w:type="spellEnd"/>
+      <w:r>
+        <w:t xml:space="preserve"> Sapphire hugs the barrels of quartzite. Ahem, thank you, thank you for this! Ah, as repayment, you can contact us if you need any equipment repaired, or if you want to create magical stuff!</w:t>
       </w:r>
     </w:p>
     <w:p>

</xml_diff>